<commit_message>
Update PROCESS.md, README.md, and POC.docx to reflect April 2026 work
Co-Authored-By: Claude Sonnet 4.6 <noreply@anthropic.com>
</commit_message>
<xml_diff>
--- a/Recipe_Multiplier_POC.docx
+++ b/Recipe_Multiplier_POC.docx
@@ -3012,6 +3012,96 @@
           <w:szCs w:val="22"/>
         </w:rPr>
         <w:t xml:space="preserve">Email recipe (mailto: link), copy to clipboard, print view</w:t>
+      </w:r>
+    </w:p>
+    <w:p>
+      <w:pPr>
+        <w:pStyle w:val="ListParagraph"/>
+        <w:numPr>
+          <w:ilvl w:val="0"/>
+          <w:numId w:val="2"/>
+        </w:numPr>
+        <w:spacing w:after="60"/>
+      </w:pPr>
+      <w:r>
+        <w:rPr>
+          <w:rFonts w:ascii="Arial" w:cs="Arial" w:eastAsia="Arial" w:hAnsi="Arial"/>
+          <w:sz w:val="22"/>
+          <w:szCs w:val="22"/>
+        </w:rPr>
+        <w:t xml:space="preserve">Weight/volume display toggle (⚖ Weight / 📏 Volume / Both) with per-recipe and global preference; density estimates from USDA FoodData Central</w:t>
+      </w:r>
+    </w:p>
+    <w:p>
+      <w:pPr>
+        <w:pStyle w:val="ListParagraph"/>
+        <w:numPr>
+          <w:ilvl w:val="0"/>
+          <w:numId w:val="2"/>
+        </w:numPr>
+        <w:spacing w:after="60"/>
+      </w:pPr>
+      <w:r>
+        <w:rPr>
+          <w:rFonts w:ascii="Arial" w:cs="Arial" w:eastAsia="Arial" w:hAnsi="Arial"/>
+          <w:sz w:val="22"/>
+          <w:szCs w:val="22"/>
+        </w:rPr>
+        <w:t xml:space="preserve">Contact form (/contact) with optional screenshot upload, powered by Resend</w:t>
+      </w:r>
+    </w:p>
+    <w:p>
+      <w:pPr>
+        <w:pStyle w:val="ListParagraph"/>
+        <w:numPr>
+          <w:ilvl w:val="0"/>
+          <w:numId w:val="2"/>
+        </w:numPr>
+        <w:spacing w:after="60"/>
+      </w:pPr>
+      <w:r>
+        <w:rPr>
+          <w:rFonts w:ascii="Arial" w:cs="Arial" w:eastAsia="Arial" w:hAnsi="Arial"/>
+          <w:sz w:val="22"/>
+          <w:szCs w:val="22"/>
+        </w:rPr>
+        <w:t xml:space="preserve">Privacy Policy and Terms of Service pages; site footer with links on all pages</w:t>
+      </w:r>
+    </w:p>
+    <w:p>
+      <w:pPr>
+        <w:pStyle w:val="ListParagraph"/>
+        <w:numPr>
+          <w:ilvl w:val="0"/>
+          <w:numId w:val="2"/>
+        </w:numPr>
+        <w:spacing w:after="60"/>
+      </w:pPr>
+      <w:r>
+        <w:rPr>
+          <w:rFonts w:ascii="Arial" w:cs="Arial" w:eastAsia="Arial" w:hAnsi="Arial"/>
+          <w:sz w:val="22"/>
+          <w:szCs w:val="22"/>
+        </w:rPr>
+        <w:t xml:space="preserve">User feedback portal via Featurebase; dismissible onboarding callouts (weight toggle tip, save recipe prompt)</w:t>
+      </w:r>
+    </w:p>
+    <w:p>
+      <w:pPr>
+        <w:pStyle w:val="ListParagraph"/>
+        <w:numPr>
+          <w:ilvl w:val="0"/>
+          <w:numId w:val="2"/>
+        </w:numPr>
+        <w:spacing w:after="60"/>
+      </w:pPr>
+      <w:r>
+        <w:rPr>
+          <w:rFonts w:ascii="Arial" w:cs="Arial" w:eastAsia="Arial" w:hAnsi="Arial"/>
+          <w:sz w:val="22"/>
+          <w:szCs w:val="22"/>
+        </w:rPr>
+        <w:t xml:space="preserve">Custom 404 page; “Shared with [Name]” display on recipe cards and detail view</w:t>
       </w:r>
     </w:p>
     <w:p>

</xml_diff>

<commit_message>
Update Recipe_Multiplier_POC.docx for UI polish and infrastructure session
Adds .env.example row to project files table, updates .env.local
description to include RESEND_API_KEY, and notes inline confirm
for share access removal.

Co-Authored-By: Claude Sonnet 4.6 <noreply@anthropic.com>
</commit_message>
<xml_diff>
--- a/Recipe_Multiplier_POC.docx
+++ b/Recipe_Multiplier_POC.docx
@@ -502,7 +502,7 @@
                 <w:sz w:val="20"/>
                 <w:szCs w:val="20"/>
               </w:rPr>
-              <w:t xml:space="preserve">Google Drive-style per-recipe sharing. Owner shares by email with view or edit permission. Manage access panel shows avatars, current permissions, and allows changes or revocation.</w:t>
+              <w:t xml:space="preserve">Google Drive-style per-recipe sharing. Owner shares by email with view or edit permission. Manage access panel shows avatars, current permissions, and allows changes or revocation (inline confirm required before removing access). Recipe cards and detail view show the names of people the recipe is shared with.</w:t>
             </w:r>
           </w:p>
         </w:tc>
@@ -2828,7 +2828,65 @@
                 <w:sz w:val="20"/>
                 <w:szCs w:val="20"/>
               </w:rPr>
-              <w:t xml:space="preserve">Supabase URL + anon key (not committed to repo)</w:t>
+              <w:t xml:space="preserve">Supabase URL + anon key + Resend API key (not committed to repo)</w:t>
+            </w:r>
+          </w:p>
+        </w:tc>
+      </w:tr>
+      <w:tr>
+        <w:tc>
+          <w:tcPr>
+            <w:tcW w:type="dxa" w:w="2800"/>
+            <w:tcBorders>
+              <w:top w:val="single" w:color="CCCCCC" w:sz="1"/>
+              <w:left w:val="single" w:color="CCCCCC" w:sz="1"/>
+              <w:bottom w:val="single" w:color="CCCCCC" w:sz="1"/>
+              <w:right w:val="single" w:color="CCCCCC" w:sz="1"/>
+            </w:tcBorders>
+            <w:tcMar>
+              <w:top w:type="dxa" w:w="100"/>
+              <w:left w:type="dxa" w:w="140"/>
+              <w:bottom w:type="dxa" w:w="100"/>
+              <w:right w:type="dxa" w:w="140"/>
+            </w:tcMar>
+          </w:tcPr>
+          <w:p>
+            <w:r>
+              <w:rPr>
+                <w:rFonts w:ascii="Arial" w:cs="Arial" w:eastAsia="Arial" w:hAnsi="Arial"/>
+                <w:b/>
+                <w:bCs/>
+                <w:sz w:val="20"/>
+                <w:szCs w:val="20"/>
+              </w:rPr>
+              <w:t xml:space="preserve">.env.example</w:t>
+            </w:r>
+          </w:p>
+        </w:tc>
+        <w:tc>
+          <w:tcPr>
+            <w:tcW w:type="dxa" w:w="6560"/>
+            <w:tcBorders>
+              <w:top w:val="single" w:color="CCCCCC" w:sz="1"/>
+              <w:left w:val="single" w:color="CCCCCC" w:sz="1"/>
+              <w:bottom w:val="single" w:color="CCCCCC" w:sz="1"/>
+              <w:right w:val="single" w:color="CCCCCC" w:sz="1"/>
+            </w:tcBorders>
+            <w:tcMar>
+              <w:top w:type="dxa" w:w="100"/>
+              <w:left w:type="dxa" w:w="140"/>
+              <w:bottom w:type="dxa" w:w="100"/>
+              <w:right w:type="dxa" w:w="140"/>
+            </w:tcMar>
+          </w:tcPr>
+          <w:p>
+            <w:r>
+              <w:rPr>
+                <w:rFonts w:ascii="Arial" w:cs="Arial" w:eastAsia="Arial" w:hAnsi="Arial"/>
+                <w:sz w:val="20"/>
+                <w:szCs w:val="20"/>
+              </w:rPr>
+              <w:t xml:space="preserve">Placeholder template listing all required environment variables; committed to repo so setup requirements are visible</w:t>
             </w:r>
           </w:p>
         </w:tc>

</xml_diff>